<commit_message>
Fix send_report.py: read tokens from .env, handle daily_stats schema safely
</commit_message>
<xml_diff>
--- a/Готов пошаговый план реализации всех 15 улучшений.docx
+++ b/Готов пошаговый план реализации всех 15 улучшений.docx
@@ -947,7 +947,7 @@
           </mc:Choice>
           <mc:Fallback>
             <w:pict>
-              <v:rect w14:anchorId="49B8C76E" id="Прямоугольник 1" o:spid="_x0000_s1026" alt="vscode-file://vscode-app/c:/Users/admin/AppData/Local/Programs/Antigravity/resources/app/extensions/theme-symbols/src/icons/files/markdown.svg" style="width:24pt;height:24pt;visibility:visible;mso-wrap-style:square;mso-left-percent:-10001;mso-top-percent:-10001;mso-position-horizontal:absolute;mso-position-horizontal-relative:char;mso-position-vertical:absolute;mso-position-vertical-relative:line;mso-left-percent:-10001;mso-top-percent:-10001;v-text-anchor:top" o:gfxdata="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" filled="f" stroked="f">
+              <v:rect w14:anchorId="26009494" id="Прямоугольник 1" o:spid="_x0000_s1026" alt="vscode-file://vscode-app/c:/Users/admin/AppData/Local/Programs/Antigravity/resources/app/extensions/theme-symbols/src/icons/files/markdown.svg" style="width:24pt;height:24pt;visibility:visible;mso-wrap-style:square;mso-left-percent:-10001;mso-top-percent:-10001;mso-position-horizontal:absolute;mso-position-horizontal-relative:char;mso-position-vertical:absolute;mso-position-vertical-relative:line;mso-left-percent:-10001;mso-top-percent:-10001;v-text-anchor:top" o:gfxdata="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" filled="f" stroked="f">
                 <o:lock v:ext="edit" aspectratio="t"/>
                 <w10:anchorlock/>
               </v:rect>
@@ -998,6 +998,1604 @@
           <w:lang w:eastAsia="ru-RU"/>
         </w:rPr>
         <w:t>✅</w:t>
+      </w:r>
+    </w:p>
+    <w:p>
+      <w:pPr>
+        <w:rPr>
+          <w:rFonts w:ascii="Segoe UI" w:eastAsia="Times New Roman" w:hAnsi="Segoe UI" w:cs="Segoe UI"/>
+          <w:color w:val="787C99"/>
+          <w:sz w:val="20"/>
+          <w:szCs w:val="20"/>
+          <w:bdr w:val="single" w:sz="2" w:space="0" w:color="E5E7EB" w:frame="1"/>
+          <w:lang w:eastAsia="ru-RU"/>
+        </w:rPr>
+      </w:pPr>
+    </w:p>
+    <w:p>
+      <w:pPr>
+        <w:rPr>
+          <w:rFonts w:ascii="Segoe UI" w:eastAsia="Times New Roman" w:hAnsi="Segoe UI" w:cs="Segoe UI"/>
+          <w:color w:val="787C99"/>
+          <w:sz w:val="20"/>
+          <w:szCs w:val="20"/>
+          <w:bdr w:val="single" w:sz="2" w:space="0" w:color="E5E7EB" w:frame="1"/>
+          <w:lang w:eastAsia="ru-RU"/>
+        </w:rPr>
+      </w:pPr>
+    </w:p>
+    <w:p>
+      <w:pPr>
+        <w:rPr>
+          <w:rFonts w:ascii="Segoe UI" w:eastAsia="Times New Roman" w:hAnsi="Segoe UI" w:cs="Segoe UI"/>
+          <w:color w:val="787C99"/>
+          <w:sz w:val="20"/>
+          <w:szCs w:val="20"/>
+          <w:bdr w:val="single" w:sz="2" w:space="0" w:color="E5E7EB" w:frame="1"/>
+          <w:lang w:eastAsia="ru-RU"/>
+        </w:rPr>
+      </w:pPr>
+    </w:p>
+    <w:p>
+      <w:pPr>
+        <w:pBdr>
+          <w:top w:val="single" w:sz="2" w:space="0" w:color="E5E7EB"/>
+          <w:left w:val="single" w:sz="2" w:space="0" w:color="E5E7EB"/>
+          <w:bottom w:val="single" w:sz="2" w:space="0" w:color="E5E7EB"/>
+          <w:right w:val="single" w:sz="2" w:space="0" w:color="E5E7EB"/>
+        </w:pBdr>
+        <w:spacing w:after="0" w:line="240" w:lineRule="auto"/>
+        <w:rPr>
+          <w:rFonts w:ascii="Times New Roman" w:eastAsia="Times New Roman" w:hAnsi="Times New Roman" w:cs="Times New Roman"/>
+          <w:sz w:val="24"/>
+          <w:szCs w:val="24"/>
+          <w:lang w:eastAsia="ru-RU"/>
+        </w:rPr>
+      </w:pPr>
+      <w:r>
+        <w:rPr>
+          <w:rFonts w:ascii="Times New Roman" w:eastAsia="Times New Roman" w:hAnsi="Times New Roman" w:cs="Times New Roman"/>
+          <w:sz w:val="24"/>
+          <w:szCs w:val="24"/>
+          <w:lang w:eastAsia="ru-RU"/>
+        </w:rPr>
+        <w:t>Конечно! Объясняю максимально просто:</w:t>
+      </w:r>
+    </w:p>
+    <w:p>
+      <w:pPr>
+        <w:spacing w:after="0" w:line="240" w:lineRule="auto"/>
+        <w:rPr>
+          <w:rFonts w:ascii="Times New Roman" w:eastAsia="Times New Roman" w:hAnsi="Times New Roman" w:cs="Times New Roman"/>
+          <w:sz w:val="24"/>
+          <w:szCs w:val="24"/>
+          <w:lang w:eastAsia="ru-RU"/>
+        </w:rPr>
+      </w:pPr>
+      <w:r>
+        <w:rPr>
+          <w:rFonts w:ascii="Times New Roman" w:eastAsia="Times New Roman" w:hAnsi="Times New Roman" w:cs="Times New Roman"/>
+          <w:sz w:val="24"/>
+          <w:szCs w:val="24"/>
+          <w:lang w:eastAsia="ru-RU"/>
+        </w:rPr>
+        <w:pict>
+          <v:rect id="_x0000_i1025" style="width:236.25pt;height:.75pt" o:hrpct="0" o:hralign="center" o:hrstd="t" o:hr="t" fillcolor="#a0a0a0" stroked="f"/>
+        </w:pict>
+      </w:r>
+    </w:p>
+    <w:p>
+      <w:pPr>
+        <w:pBdr>
+          <w:top w:val="single" w:sz="2" w:space="0" w:color="E5E7EB"/>
+          <w:left w:val="single" w:sz="2" w:space="0" w:color="E5E7EB"/>
+          <w:bottom w:val="single" w:sz="2" w:space="0" w:color="E5E7EB"/>
+          <w:right w:val="single" w:sz="2" w:space="0" w:color="E5E7EB"/>
+        </w:pBdr>
+        <w:spacing w:before="100" w:beforeAutospacing="1" w:after="100" w:afterAutospacing="1" w:line="240" w:lineRule="auto"/>
+        <w:outlineLvl w:val="2"/>
+        <w:rPr>
+          <w:rFonts w:ascii="Times New Roman" w:eastAsia="Times New Roman" w:hAnsi="Times New Roman" w:cs="Times New Roman"/>
+          <w:sz w:val="27"/>
+          <w:szCs w:val="27"/>
+          <w:bdr w:val="single" w:sz="2" w:space="0" w:color="E5E7EB" w:frame="1"/>
+          <w:lang w:eastAsia="ru-RU"/>
+        </w:rPr>
+      </w:pPr>
+      <w:r>
+        <w:rPr>
+          <w:rFonts w:ascii="Times New Roman" w:eastAsia="Times New Roman" w:hAnsi="Times New Roman" w:cs="Times New Roman"/>
+          <w:sz w:val="27"/>
+          <w:szCs w:val="27"/>
+          <w:lang w:eastAsia="ru-RU"/>
+        </w:rPr>
+        <w:t>1. </w:t>
+      </w:r>
+    </w:p>
+    <w:p>
+      <w:pPr>
+        <w:pBdr>
+          <w:top w:val="single" w:sz="2" w:space="0" w:color="E5E7EB"/>
+          <w:left w:val="single" w:sz="2" w:space="0" w:color="E5E7EB"/>
+          <w:bottom w:val="single" w:sz="2" w:space="0" w:color="E5E7EB"/>
+          <w:right w:val="single" w:sz="2" w:space="0" w:color="E5E7EB"/>
+        </w:pBdr>
+        <w:spacing w:before="100" w:beforeAutospacing="1" w:after="100" w:afterAutospacing="1" w:line="240" w:lineRule="auto"/>
+        <w:outlineLvl w:val="2"/>
+        <w:rPr>
+          <w:rFonts w:ascii="Times New Roman" w:eastAsia="Times New Roman" w:hAnsi="Times New Roman" w:cs="Times New Roman"/>
+          <w:b/>
+          <w:bCs/>
+          <w:sz w:val="27"/>
+          <w:szCs w:val="27"/>
+          <w:lang w:eastAsia="ru-RU"/>
+        </w:rPr>
+      </w:pPr>
+      <w:r>
+        <w:rPr>
+          <w:rFonts w:ascii="Times New Roman" w:eastAsia="Times New Roman" w:hAnsi="Times New Roman" w:cs="Times New Roman"/>
+          <w:noProof/>
+          <w:sz w:val="27"/>
+          <w:szCs w:val="27"/>
+          <w:bdr w:val="single" w:sz="2" w:space="0" w:color="E5E7EB" w:frame="1"/>
+          <w:lang w:eastAsia="ru-RU"/>
+        </w:rPr>
+        <mc:AlternateContent>
+          <mc:Choice Requires="wps">
+            <w:drawing>
+              <wp:inline distT="0" distB="0" distL="0" distR="0">
+                <wp:extent cx="304800" cy="304800"/>
+                <wp:effectExtent l="0" t="0" r="0" b="0"/>
+                <wp:docPr id="3" name="Прямоугольник 3" descr="vscode-file://vscode-app/c:/Users/admin/AppData/Local/Programs/Antigravity/resources/app/extensions/theme-symbols/src/icons/files/python.svg"/>
+                <wp:cNvGraphicFramePr>
+                  <a:graphicFrameLocks xmlns:a="http://schemas.openxmlformats.org/drawingml/2006/main" noChangeAspect="1"/>
+                </wp:cNvGraphicFramePr>
+                <a:graphic xmlns:a="http://schemas.openxmlformats.org/drawingml/2006/main">
+                  <a:graphicData uri="http://schemas.microsoft.com/office/word/2010/wordprocessingShape">
+                    <wps:wsp>
+                      <wps:cNvSpPr>
+                        <a:spLocks noChangeAspect="1" noChangeArrowheads="1"/>
+                      </wps:cNvSpPr>
+                      <wps:spPr bwMode="auto">
+                        <a:xfrm>
+                          <a:off x="0" y="0"/>
+                          <a:ext cx="304800" cy="304800"/>
+                        </a:xfrm>
+                        <a:prstGeom prst="rect">
+                          <a:avLst/>
+                        </a:prstGeom>
+                        <a:noFill/>
+                        <a:ln>
+                          <a:noFill/>
+                        </a:ln>
+                        <a:extLst>
+                          <a:ext uri="{909E8E84-426E-40DD-AFC4-6F175D3DCCD1}">
+                            <a14:hiddenFill xmlns:a14="http://schemas.microsoft.com/office/drawing/2010/main">
+                              <a:solidFill>
+                                <a:srgbClr val="FFFFFF"/>
+                              </a:solidFill>
+                            </a14:hiddenFill>
+                          </a:ext>
+                          <a:ext uri="{91240B29-F687-4F45-9708-019B960494DF}">
+                            <a14:hiddenLine xmlns:a14="http://schemas.microsoft.com/office/drawing/2010/main" w="9525">
+                              <a:solidFill>
+                                <a:srgbClr val="000000"/>
+                              </a:solidFill>
+                              <a:miter lim="800000"/>
+                              <a:headEnd/>
+                              <a:tailEnd/>
+                            </a14:hiddenLine>
+                          </a:ext>
+                        </a:extLst>
+                      </wps:spPr>
+                      <wps:bodyPr rot="0" vert="horz" wrap="square" lIns="91440" tIns="45720" rIns="91440" bIns="45720" anchor="t" anchorCtr="0" upright="1">
+                        <a:noAutofit/>
+                      </wps:bodyPr>
+                    </wps:wsp>
+                  </a:graphicData>
+                </a:graphic>
+              </wp:inline>
+            </w:drawing>
+          </mc:Choice>
+          <mc:Fallback>
+            <w:pict>
+              <v:rect w14:anchorId="2205DF71" id="Прямоугольник 3" o:spid="_x0000_s1026" alt="vscode-file://vscode-app/c:/Users/admin/AppData/Local/Programs/Antigravity/resources/app/extensions/theme-symbols/src/icons/files/python.svg" style="width:24pt;height:24pt;visibility:visible;mso-wrap-style:square;mso-left-percent:-10001;mso-top-percent:-10001;mso-position-horizontal:absolute;mso-position-horizontal-relative:char;mso-position-vertical:absolute;mso-position-vertical-relative:line;mso-left-percent:-10001;mso-top-percent:-10001;v-text-anchor:top" o:gfxdata="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" filled="f" stroked="f">
+                <o:lock v:ext="edit" aspectratio="t"/>
+                <w10:anchorlock/>
+              </v:rect>
+            </w:pict>
+          </mc:Fallback>
+        </mc:AlternateContent>
+      </w:r>
+    </w:p>
+    <w:p>
+      <w:pPr>
+        <w:pBdr>
+          <w:top w:val="single" w:sz="2" w:space="0" w:color="E5E7EB"/>
+          <w:left w:val="single" w:sz="2" w:space="0" w:color="E5E7EB"/>
+          <w:bottom w:val="single" w:sz="2" w:space="0" w:color="E5E7EB"/>
+          <w:right w:val="single" w:sz="2" w:space="0" w:color="E5E7EB"/>
+        </w:pBdr>
+        <w:spacing w:before="100" w:beforeAutospacing="1" w:after="100" w:afterAutospacing="1" w:line="240" w:lineRule="auto"/>
+        <w:outlineLvl w:val="2"/>
+        <w:rPr>
+          <w:rFonts w:ascii="Times New Roman" w:eastAsia="Times New Roman" w:hAnsi="Times New Roman" w:cs="Times New Roman"/>
+          <w:sz w:val="27"/>
+          <w:szCs w:val="27"/>
+          <w:lang w:eastAsia="ru-RU"/>
+        </w:rPr>
+      </w:pPr>
+      <w:proofErr w:type="spellStart"/>
+      <w:proofErr w:type="gramStart"/>
+      <w:r>
+        <w:rPr>
+          <w:rFonts w:ascii="Times New Roman" w:eastAsia="Times New Roman" w:hAnsi="Times New Roman" w:cs="Times New Roman"/>
+          <w:sz w:val="27"/>
+          <w:szCs w:val="27"/>
+          <w:bdr w:val="single" w:sz="2" w:space="0" w:color="E5E7EB" w:frame="1"/>
+          <w:lang w:eastAsia="ru-RU"/>
+        </w:rPr>
+        <w:t>daily</w:t>
+      </w:r>
+      <w:proofErr w:type="gramEnd"/>
+      <w:r>
+        <w:rPr>
+          <w:rFonts w:ascii="Times New Roman" w:eastAsia="Times New Roman" w:hAnsi="Times New Roman" w:cs="Times New Roman"/>
+          <w:sz w:val="27"/>
+          <w:szCs w:val="27"/>
+          <w:bdr w:val="single" w:sz="2" w:space="0" w:color="E5E7EB" w:frame="1"/>
+          <w:lang w:eastAsia="ru-RU"/>
+        </w:rPr>
+        <w:t>_stats</w:t>
+      </w:r>
+      <w:proofErr w:type="spellEnd"/>
+      <w:r>
+        <w:rPr>
+          <w:rFonts w:ascii="Times New Roman" w:eastAsia="Times New Roman" w:hAnsi="Times New Roman" w:cs="Times New Roman"/>
+          <w:sz w:val="27"/>
+          <w:szCs w:val="27"/>
+          <w:lang w:eastAsia="ru-RU"/>
+        </w:rPr>
+        <w:t> — дневная статистика</w:t>
+      </w:r>
+    </w:p>
+    <w:p>
+      <w:pPr>
+        <w:pBdr>
+          <w:top w:val="single" w:sz="2" w:space="0" w:color="E5E7EB"/>
+          <w:left w:val="single" w:sz="2" w:space="0" w:color="E5E7EB"/>
+          <w:bottom w:val="single" w:sz="2" w:space="0" w:color="E5E7EB"/>
+          <w:right w:val="single" w:sz="2" w:space="0" w:color="E5E7EB"/>
+        </w:pBdr>
+        <w:spacing w:after="0" w:line="240" w:lineRule="auto"/>
+        <w:rPr>
+          <w:rFonts w:ascii="Times New Roman" w:eastAsia="Times New Roman" w:hAnsi="Times New Roman" w:cs="Times New Roman"/>
+          <w:sz w:val="24"/>
+          <w:szCs w:val="24"/>
+          <w:lang w:eastAsia="ru-RU"/>
+        </w:rPr>
+      </w:pPr>
+      <w:r>
+        <w:rPr>
+          <w:rFonts w:ascii="Times New Roman" w:eastAsia="Times New Roman" w:hAnsi="Times New Roman" w:cs="Times New Roman"/>
+          <w:b/>
+          <w:bCs/>
+          <w:sz w:val="24"/>
+          <w:szCs w:val="24"/>
+          <w:bdr w:val="single" w:sz="2" w:space="0" w:color="E5E7EB" w:frame="1"/>
+          <w:lang w:eastAsia="ru-RU"/>
+        </w:rPr>
+        <w:t>Представь</w:t>
+      </w:r>
+      <w:r>
+        <w:rPr>
+          <w:rFonts w:ascii="Times New Roman" w:eastAsia="Times New Roman" w:hAnsi="Times New Roman" w:cs="Times New Roman"/>
+          <w:sz w:val="24"/>
+          <w:szCs w:val="24"/>
+          <w:lang w:eastAsia="ru-RU"/>
+        </w:rPr>
+        <w:t>: Ты торгуешь на рынке каждый день. В конце дня записываешь в тетрадку: «Сегодня продал 5 яблок, заработал 100 рублей». На следующий день — ещё запись.</w:t>
+      </w:r>
+    </w:p>
+    <w:p>
+      <w:pPr>
+        <w:pBdr>
+          <w:top w:val="single" w:sz="2" w:space="0" w:color="E5E7EB"/>
+          <w:left w:val="single" w:sz="2" w:space="0" w:color="E5E7EB"/>
+          <w:bottom w:val="single" w:sz="2" w:space="0" w:color="E5E7EB"/>
+          <w:right w:val="single" w:sz="2" w:space="0" w:color="E5E7EB"/>
+        </w:pBdr>
+        <w:spacing w:after="0" w:line="240" w:lineRule="auto"/>
+        <w:rPr>
+          <w:rFonts w:ascii="Times New Roman" w:eastAsia="Times New Roman" w:hAnsi="Times New Roman" w:cs="Times New Roman"/>
+          <w:sz w:val="24"/>
+          <w:szCs w:val="24"/>
+          <w:bdr w:val="single" w:sz="2" w:space="0" w:color="E5E7EB" w:frame="1"/>
+          <w:lang w:eastAsia="ru-RU"/>
+        </w:rPr>
+      </w:pPr>
+      <w:r>
+        <w:rPr>
+          <w:rFonts w:ascii="Times New Roman" w:eastAsia="Times New Roman" w:hAnsi="Times New Roman" w:cs="Times New Roman"/>
+          <w:b/>
+          <w:bCs/>
+          <w:sz w:val="24"/>
+          <w:szCs w:val="24"/>
+          <w:bdr w:val="single" w:sz="2" w:space="0" w:color="E5E7EB" w:frame="1"/>
+          <w:lang w:eastAsia="ru-RU"/>
+        </w:rPr>
+        <w:t>Сейчас</w:t>
+      </w:r>
+      <w:r>
+        <w:rPr>
+          <w:rFonts w:ascii="Times New Roman" w:eastAsia="Times New Roman" w:hAnsi="Times New Roman" w:cs="Times New Roman"/>
+          <w:sz w:val="24"/>
+          <w:szCs w:val="24"/>
+          <w:lang w:eastAsia="ru-RU"/>
+        </w:rPr>
+        <w:t>: Бот торгует, но </w:t>
+      </w:r>
+      <w:r>
+        <w:rPr>
+          <w:rFonts w:ascii="Times New Roman" w:eastAsia="Times New Roman" w:hAnsi="Times New Roman" w:cs="Times New Roman"/>
+          <w:b/>
+          <w:bCs/>
+          <w:sz w:val="24"/>
+          <w:szCs w:val="24"/>
+          <w:bdr w:val="single" w:sz="2" w:space="0" w:color="E5E7EB" w:frame="1"/>
+          <w:lang w:eastAsia="ru-RU"/>
+        </w:rPr>
+        <w:t>ничего не записывает</w:t>
+      </w:r>
+      <w:r>
+        <w:rPr>
+          <w:rFonts w:ascii="Times New Roman" w:eastAsia="Times New Roman" w:hAnsi="Times New Roman" w:cs="Times New Roman"/>
+          <w:sz w:val="24"/>
+          <w:szCs w:val="24"/>
+          <w:lang w:eastAsia="ru-RU"/>
+        </w:rPr>
+        <w:t> в эту «тетрадку» (таблицу </w:t>
+      </w:r>
+    </w:p>
+    <w:p>
+      <w:pPr>
+        <w:spacing w:after="0" w:line="240" w:lineRule="auto"/>
+        <w:rPr>
+          <w:rFonts w:ascii="Times New Roman" w:eastAsia="Times New Roman" w:hAnsi="Times New Roman" w:cs="Times New Roman"/>
+          <w:sz w:val="24"/>
+          <w:szCs w:val="24"/>
+          <w:lang w:eastAsia="ru-RU"/>
+        </w:rPr>
+      </w:pPr>
+      <w:r>
+        <w:rPr>
+          <w:rFonts w:ascii="Times New Roman" w:eastAsia="Times New Roman" w:hAnsi="Times New Roman" w:cs="Times New Roman"/>
+          <w:noProof/>
+          <w:sz w:val="24"/>
+          <w:szCs w:val="24"/>
+          <w:bdr w:val="single" w:sz="2" w:space="0" w:color="E5E7EB" w:frame="1"/>
+          <w:lang w:eastAsia="ru-RU"/>
+        </w:rPr>
+        <mc:AlternateContent>
+          <mc:Choice Requires="wps">
+            <w:drawing>
+              <wp:inline distT="0" distB="0" distL="0" distR="0">
+                <wp:extent cx="304800" cy="304800"/>
+                <wp:effectExtent l="0" t="0" r="0" b="0"/>
+                <wp:docPr id="2" name="Прямоугольник 2" descr="vscode-file://vscode-app/c:/Users/admin/AppData/Local/Programs/Antigravity/resources/app/extensions/theme-symbols/src/icons/files/python.svg"/>
+                <wp:cNvGraphicFramePr>
+                  <a:graphicFrameLocks xmlns:a="http://schemas.openxmlformats.org/drawingml/2006/main" noChangeAspect="1"/>
+                </wp:cNvGraphicFramePr>
+                <a:graphic xmlns:a="http://schemas.openxmlformats.org/drawingml/2006/main">
+                  <a:graphicData uri="http://schemas.microsoft.com/office/word/2010/wordprocessingShape">
+                    <wps:wsp>
+                      <wps:cNvSpPr>
+                        <a:spLocks noChangeAspect="1" noChangeArrowheads="1"/>
+                      </wps:cNvSpPr>
+                      <wps:spPr bwMode="auto">
+                        <a:xfrm>
+                          <a:off x="0" y="0"/>
+                          <a:ext cx="304800" cy="304800"/>
+                        </a:xfrm>
+                        <a:prstGeom prst="rect">
+                          <a:avLst/>
+                        </a:prstGeom>
+                        <a:noFill/>
+                        <a:ln>
+                          <a:noFill/>
+                        </a:ln>
+                        <a:extLst>
+                          <a:ext uri="{909E8E84-426E-40DD-AFC4-6F175D3DCCD1}">
+                            <a14:hiddenFill xmlns:a14="http://schemas.microsoft.com/office/drawing/2010/main">
+                              <a:solidFill>
+                                <a:srgbClr val="FFFFFF"/>
+                              </a:solidFill>
+                            </a14:hiddenFill>
+                          </a:ext>
+                          <a:ext uri="{91240B29-F687-4F45-9708-019B960494DF}">
+                            <a14:hiddenLine xmlns:a14="http://schemas.microsoft.com/office/drawing/2010/main" w="9525">
+                              <a:solidFill>
+                                <a:srgbClr val="000000"/>
+                              </a:solidFill>
+                              <a:miter lim="800000"/>
+                              <a:headEnd/>
+                              <a:tailEnd/>
+                            </a14:hiddenLine>
+                          </a:ext>
+                        </a:extLst>
+                      </wps:spPr>
+                      <wps:bodyPr rot="0" vert="horz" wrap="square" lIns="91440" tIns="45720" rIns="91440" bIns="45720" anchor="t" anchorCtr="0" upright="1">
+                        <a:noAutofit/>
+                      </wps:bodyPr>
+                    </wps:wsp>
+                  </a:graphicData>
+                </a:graphic>
+              </wp:inline>
+            </w:drawing>
+          </mc:Choice>
+          <mc:Fallback>
+            <w:pict>
+              <v:rect w14:anchorId="4F84EA37" id="Прямоугольник 2" o:spid="_x0000_s1026" alt="vscode-file://vscode-app/c:/Users/admin/AppData/Local/Programs/Antigravity/resources/app/extensions/theme-symbols/src/icons/files/python.svg" style="width:24pt;height:24pt;visibility:visible;mso-wrap-style:square;mso-left-percent:-10001;mso-top-percent:-10001;mso-position-horizontal:absolute;mso-position-horizontal-relative:char;mso-position-vertical:absolute;mso-position-vertical-relative:line;mso-left-percent:-10001;mso-top-percent:-10001;v-text-anchor:top" o:gfxdata="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" filled="f" stroked="f">
+                <o:lock v:ext="edit" aspectratio="t"/>
+                <w10:anchorlock/>
+              </v:rect>
+            </w:pict>
+          </mc:Fallback>
+        </mc:AlternateContent>
+      </w:r>
+    </w:p>
+    <w:p>
+      <w:pPr>
+        <w:spacing w:after="0" w:line="240" w:lineRule="auto"/>
+        <w:rPr>
+          <w:rFonts w:ascii="Times New Roman" w:eastAsia="Times New Roman" w:hAnsi="Times New Roman" w:cs="Times New Roman"/>
+          <w:sz w:val="24"/>
+          <w:szCs w:val="24"/>
+          <w:bdr w:val="single" w:sz="2" w:space="0" w:color="E5E7EB" w:frame="1"/>
+          <w:lang w:eastAsia="ru-RU"/>
+        </w:rPr>
+      </w:pPr>
+      <w:proofErr w:type="spellStart"/>
+      <w:proofErr w:type="gramStart"/>
+      <w:r>
+        <w:rPr>
+          <w:rFonts w:ascii="Times New Roman" w:eastAsia="Times New Roman" w:hAnsi="Times New Roman" w:cs="Times New Roman"/>
+          <w:sz w:val="24"/>
+          <w:szCs w:val="24"/>
+          <w:bdr w:val="single" w:sz="2" w:space="0" w:color="E5E7EB" w:frame="1"/>
+          <w:lang w:eastAsia="ru-RU"/>
+        </w:rPr>
+        <w:t>daily</w:t>
+      </w:r>
+      <w:proofErr w:type="gramEnd"/>
+      <w:r>
+        <w:rPr>
+          <w:rFonts w:ascii="Times New Roman" w:eastAsia="Times New Roman" w:hAnsi="Times New Roman" w:cs="Times New Roman"/>
+          <w:sz w:val="24"/>
+          <w:szCs w:val="24"/>
+          <w:bdr w:val="single" w:sz="2" w:space="0" w:color="E5E7EB" w:frame="1"/>
+          <w:lang w:eastAsia="ru-RU"/>
+        </w:rPr>
+        <w:t>_stats</w:t>
+      </w:r>
+      <w:proofErr w:type="spellEnd"/>
+      <w:r>
+        <w:rPr>
+          <w:rFonts w:ascii="Times New Roman" w:eastAsia="Times New Roman" w:hAnsi="Times New Roman" w:cs="Times New Roman"/>
+          <w:sz w:val="24"/>
+          <w:szCs w:val="24"/>
+          <w:bdr w:val="single" w:sz="2" w:space="0" w:color="E5E7EB" w:frame="1"/>
+          <w:lang w:eastAsia="ru-RU"/>
+        </w:rPr>
+        <w:t xml:space="preserve"> в базе данных). Он отправляет сводку в </w:t>
+      </w:r>
+      <w:proofErr w:type="spellStart"/>
+      <w:r>
+        <w:rPr>
+          <w:rFonts w:ascii="Times New Roman" w:eastAsia="Times New Roman" w:hAnsi="Times New Roman" w:cs="Times New Roman"/>
+          <w:sz w:val="24"/>
+          <w:szCs w:val="24"/>
+          <w:bdr w:val="single" w:sz="2" w:space="0" w:color="E5E7EB" w:frame="1"/>
+          <w:lang w:eastAsia="ru-RU"/>
+        </w:rPr>
+        <w:t>Telegram</w:t>
+      </w:r>
+      <w:proofErr w:type="spellEnd"/>
+      <w:r>
+        <w:rPr>
+          <w:rFonts w:ascii="Times New Roman" w:eastAsia="Times New Roman" w:hAnsi="Times New Roman" w:cs="Times New Roman"/>
+          <w:sz w:val="24"/>
+          <w:szCs w:val="24"/>
+          <w:bdr w:val="single" w:sz="2" w:space="0" w:color="E5E7EB" w:frame="1"/>
+          <w:lang w:eastAsia="ru-RU"/>
+        </w:rPr>
+        <w:t xml:space="preserve">, но не сохраняет цифры. Если </w:t>
+      </w:r>
+      <w:proofErr w:type="spellStart"/>
+      <w:r>
+        <w:rPr>
+          <w:rFonts w:ascii="Times New Roman" w:eastAsia="Times New Roman" w:hAnsi="Times New Roman" w:cs="Times New Roman"/>
+          <w:sz w:val="24"/>
+          <w:szCs w:val="24"/>
+          <w:bdr w:val="single" w:sz="2" w:space="0" w:color="E5E7EB" w:frame="1"/>
+          <w:lang w:eastAsia="ru-RU"/>
+        </w:rPr>
+        <w:t>Telegram</w:t>
+      </w:r>
+      <w:proofErr w:type="spellEnd"/>
+      <w:r>
+        <w:rPr>
+          <w:rFonts w:ascii="Times New Roman" w:eastAsia="Times New Roman" w:hAnsi="Times New Roman" w:cs="Times New Roman"/>
+          <w:sz w:val="24"/>
+          <w:szCs w:val="24"/>
+          <w:bdr w:val="single" w:sz="2" w:space="0" w:color="E5E7EB" w:frame="1"/>
+          <w:lang w:eastAsia="ru-RU"/>
+        </w:rPr>
+        <w:t>-сообщение потеряется — всё, данных нет.</w:t>
+      </w:r>
+    </w:p>
+    <w:p>
+      <w:pPr>
+        <w:pBdr>
+          <w:top w:val="single" w:sz="2" w:space="0" w:color="E5E7EB"/>
+          <w:left w:val="single" w:sz="2" w:space="0" w:color="E5E7EB"/>
+          <w:bottom w:val="single" w:sz="2" w:space="0" w:color="E5E7EB"/>
+          <w:right w:val="single" w:sz="2" w:space="0" w:color="E5E7EB"/>
+        </w:pBdr>
+        <w:spacing w:after="0" w:line="240" w:lineRule="auto"/>
+        <w:rPr>
+          <w:rFonts w:ascii="Times New Roman" w:eastAsia="Times New Roman" w:hAnsi="Times New Roman" w:cs="Times New Roman"/>
+          <w:sz w:val="24"/>
+          <w:szCs w:val="24"/>
+          <w:bdr w:val="single" w:sz="2" w:space="0" w:color="E5E7EB" w:frame="1"/>
+          <w:lang w:eastAsia="ru-RU"/>
+        </w:rPr>
+      </w:pPr>
+      <w:r>
+        <w:rPr>
+          <w:rFonts w:ascii="Times New Roman" w:eastAsia="Times New Roman" w:hAnsi="Times New Roman" w:cs="Times New Roman"/>
+          <w:b/>
+          <w:bCs/>
+          <w:sz w:val="24"/>
+          <w:szCs w:val="24"/>
+          <w:bdr w:val="single" w:sz="2" w:space="0" w:color="E5E7EB" w:frame="1"/>
+          <w:lang w:eastAsia="ru-RU"/>
+        </w:rPr>
+        <w:t>Что исправим</w:t>
+      </w:r>
+      <w:r>
+        <w:rPr>
+          <w:rFonts w:ascii="Times New Roman" w:eastAsia="Times New Roman" w:hAnsi="Times New Roman" w:cs="Times New Roman"/>
+          <w:sz w:val="24"/>
+          <w:szCs w:val="24"/>
+          <w:bdr w:val="single" w:sz="2" w:space="0" w:color="E5E7EB" w:frame="1"/>
+          <w:lang w:eastAsia="ru-RU"/>
+        </w:rPr>
+        <w:t>: Бот будет </w:t>
+      </w:r>
+      <w:r>
+        <w:rPr>
+          <w:rFonts w:ascii="Times New Roman" w:eastAsia="Times New Roman" w:hAnsi="Times New Roman" w:cs="Times New Roman"/>
+          <w:b/>
+          <w:bCs/>
+          <w:sz w:val="24"/>
+          <w:szCs w:val="24"/>
+          <w:bdr w:val="single" w:sz="2" w:space="0" w:color="E5E7EB" w:frame="1"/>
+          <w:lang w:eastAsia="ru-RU"/>
+        </w:rPr>
+        <w:t>записывать</w:t>
+      </w:r>
+      <w:r>
+        <w:rPr>
+          <w:rFonts w:ascii="Times New Roman" w:eastAsia="Times New Roman" w:hAnsi="Times New Roman" w:cs="Times New Roman"/>
+          <w:sz w:val="24"/>
+          <w:szCs w:val="24"/>
+          <w:bdr w:val="single" w:sz="2" w:space="0" w:color="E5E7EB" w:frame="1"/>
+          <w:lang w:eastAsia="ru-RU"/>
+        </w:rPr>
+        <w:t> итоги каждого дня в базу: сколько сделок, сколько заработал, какой баланс. Можно потом посмотреть историю за любой день.</w:t>
+      </w:r>
+    </w:p>
+    <w:p>
+      <w:pPr>
+        <w:spacing w:after="0" w:line="240" w:lineRule="auto"/>
+        <w:rPr>
+          <w:rFonts w:ascii="Times New Roman" w:eastAsia="Times New Roman" w:hAnsi="Times New Roman" w:cs="Times New Roman"/>
+          <w:sz w:val="24"/>
+          <w:szCs w:val="24"/>
+          <w:bdr w:val="single" w:sz="2" w:space="0" w:color="E5E7EB" w:frame="1"/>
+          <w:lang w:eastAsia="ru-RU"/>
+        </w:rPr>
+      </w:pPr>
+      <w:r>
+        <w:rPr>
+          <w:rFonts w:ascii="Times New Roman" w:eastAsia="Times New Roman" w:hAnsi="Times New Roman" w:cs="Times New Roman"/>
+          <w:sz w:val="24"/>
+          <w:szCs w:val="24"/>
+          <w:bdr w:val="single" w:sz="2" w:space="0" w:color="E5E7EB" w:frame="1"/>
+          <w:lang w:eastAsia="ru-RU"/>
+        </w:rPr>
+        <w:pict>
+          <v:rect id="_x0000_i1026" style="width:236.25pt;height:.75pt" o:hrpct="0" o:hralign="center" o:hrstd="t" o:hr="t" fillcolor="#a0a0a0" stroked="f"/>
+        </w:pict>
+      </w:r>
+    </w:p>
+    <w:p>
+      <w:pPr>
+        <w:pBdr>
+          <w:top w:val="single" w:sz="2" w:space="0" w:color="E5E7EB"/>
+          <w:left w:val="single" w:sz="2" w:space="0" w:color="E5E7EB"/>
+          <w:bottom w:val="single" w:sz="2" w:space="0" w:color="E5E7EB"/>
+          <w:right w:val="single" w:sz="2" w:space="0" w:color="E5E7EB"/>
+        </w:pBdr>
+        <w:spacing w:before="100" w:beforeAutospacing="1" w:after="100" w:afterAutospacing="1" w:line="240" w:lineRule="auto"/>
+        <w:outlineLvl w:val="2"/>
+        <w:rPr>
+          <w:rFonts w:ascii="Times New Roman" w:eastAsia="Times New Roman" w:hAnsi="Times New Roman" w:cs="Times New Roman"/>
+          <w:sz w:val="27"/>
+          <w:szCs w:val="27"/>
+          <w:bdr w:val="single" w:sz="2" w:space="0" w:color="E5E7EB" w:frame="1"/>
+          <w:lang w:eastAsia="ru-RU"/>
+        </w:rPr>
+      </w:pPr>
+      <w:r>
+        <w:rPr>
+          <w:rFonts w:ascii="Times New Roman" w:eastAsia="Times New Roman" w:hAnsi="Times New Roman" w:cs="Times New Roman"/>
+          <w:sz w:val="27"/>
+          <w:szCs w:val="27"/>
+          <w:bdr w:val="single" w:sz="2" w:space="0" w:color="E5E7EB" w:frame="1"/>
+          <w:lang w:eastAsia="ru-RU"/>
+        </w:rPr>
+        <w:t>2. </w:t>
+      </w:r>
+      <w:proofErr w:type="spellStart"/>
+      <w:r>
+        <w:rPr>
+          <w:rFonts w:ascii="Consolas" w:eastAsia="Times New Roman" w:hAnsi="Consolas" w:cs="Courier New"/>
+          <w:color w:val="9699A8"/>
+          <w:sz w:val="24"/>
+          <w:szCs w:val="24"/>
+          <w:bdr w:val="single" w:sz="2" w:space="0" w:color="E5E7EB" w:frame="1"/>
+          <w:lang w:eastAsia="ru-RU"/>
+        </w:rPr>
+        <w:t>bot_state</w:t>
+      </w:r>
+      <w:proofErr w:type="spellEnd"/>
+      <w:r>
+        <w:rPr>
+          <w:rFonts w:ascii="Times New Roman" w:eastAsia="Times New Roman" w:hAnsi="Times New Roman" w:cs="Times New Roman"/>
+          <w:sz w:val="27"/>
+          <w:szCs w:val="27"/>
+          <w:bdr w:val="single" w:sz="2" w:space="0" w:color="E5E7EB" w:frame="1"/>
+          <w:lang w:eastAsia="ru-RU"/>
+        </w:rPr>
+        <w:t> — состояние бота</w:t>
+      </w:r>
+    </w:p>
+    <w:p>
+      <w:pPr>
+        <w:pBdr>
+          <w:top w:val="single" w:sz="2" w:space="0" w:color="E5E7EB"/>
+          <w:left w:val="single" w:sz="2" w:space="0" w:color="E5E7EB"/>
+          <w:bottom w:val="single" w:sz="2" w:space="0" w:color="E5E7EB"/>
+          <w:right w:val="single" w:sz="2" w:space="0" w:color="E5E7EB"/>
+        </w:pBdr>
+        <w:spacing w:after="0" w:line="240" w:lineRule="auto"/>
+        <w:rPr>
+          <w:rFonts w:ascii="Times New Roman" w:eastAsia="Times New Roman" w:hAnsi="Times New Roman" w:cs="Times New Roman"/>
+          <w:sz w:val="24"/>
+          <w:szCs w:val="24"/>
+          <w:bdr w:val="single" w:sz="2" w:space="0" w:color="E5E7EB" w:frame="1"/>
+          <w:lang w:eastAsia="ru-RU"/>
+        </w:rPr>
+      </w:pPr>
+      <w:r>
+        <w:rPr>
+          <w:rFonts w:ascii="Times New Roman" w:eastAsia="Times New Roman" w:hAnsi="Times New Roman" w:cs="Times New Roman"/>
+          <w:b/>
+          <w:bCs/>
+          <w:sz w:val="24"/>
+          <w:szCs w:val="24"/>
+          <w:bdr w:val="single" w:sz="2" w:space="0" w:color="E5E7EB" w:frame="1"/>
+          <w:lang w:eastAsia="ru-RU"/>
+        </w:rPr>
+        <w:lastRenderedPageBreak/>
+        <w:t>Представь</w:t>
+      </w:r>
+      <w:r>
+        <w:rPr>
+          <w:rFonts w:ascii="Times New Roman" w:eastAsia="Times New Roman" w:hAnsi="Times New Roman" w:cs="Times New Roman"/>
+          <w:sz w:val="24"/>
+          <w:szCs w:val="24"/>
+          <w:bdr w:val="single" w:sz="2" w:space="0" w:color="E5E7EB" w:frame="1"/>
+          <w:lang w:eastAsia="ru-RU"/>
+        </w:rPr>
+        <w:t>: Ты играешь в игру. Вдруг выключается свет. Когда включился — игра начинается </w:t>
+      </w:r>
+      <w:r>
+        <w:rPr>
+          <w:rFonts w:ascii="Times New Roman" w:eastAsia="Times New Roman" w:hAnsi="Times New Roman" w:cs="Times New Roman"/>
+          <w:b/>
+          <w:bCs/>
+          <w:sz w:val="24"/>
+          <w:szCs w:val="24"/>
+          <w:bdr w:val="single" w:sz="2" w:space="0" w:color="E5E7EB" w:frame="1"/>
+          <w:lang w:eastAsia="ru-RU"/>
+        </w:rPr>
+        <w:t>с начала</w:t>
+      </w:r>
+      <w:r>
+        <w:rPr>
+          <w:rFonts w:ascii="Times New Roman" w:eastAsia="Times New Roman" w:hAnsi="Times New Roman" w:cs="Times New Roman"/>
+          <w:sz w:val="24"/>
+          <w:szCs w:val="24"/>
+          <w:bdr w:val="single" w:sz="2" w:space="0" w:color="E5E7EB" w:frame="1"/>
+          <w:lang w:eastAsia="ru-RU"/>
+        </w:rPr>
+        <w:t>, потому что ты не сохранялся.</w:t>
+      </w:r>
+    </w:p>
+    <w:p>
+      <w:pPr>
+        <w:pBdr>
+          <w:top w:val="single" w:sz="2" w:space="0" w:color="E5E7EB"/>
+          <w:left w:val="single" w:sz="2" w:space="0" w:color="E5E7EB"/>
+          <w:bottom w:val="single" w:sz="2" w:space="0" w:color="E5E7EB"/>
+          <w:right w:val="single" w:sz="2" w:space="0" w:color="E5E7EB"/>
+        </w:pBdr>
+        <w:spacing w:after="0" w:line="240" w:lineRule="auto"/>
+        <w:rPr>
+          <w:rFonts w:ascii="Times New Roman" w:eastAsia="Times New Roman" w:hAnsi="Times New Roman" w:cs="Times New Roman"/>
+          <w:sz w:val="24"/>
+          <w:szCs w:val="24"/>
+          <w:bdr w:val="single" w:sz="2" w:space="0" w:color="E5E7EB" w:frame="1"/>
+          <w:lang w:eastAsia="ru-RU"/>
+        </w:rPr>
+      </w:pPr>
+      <w:r>
+        <w:rPr>
+          <w:rFonts w:ascii="Times New Roman" w:eastAsia="Times New Roman" w:hAnsi="Times New Roman" w:cs="Times New Roman"/>
+          <w:b/>
+          <w:bCs/>
+          <w:sz w:val="24"/>
+          <w:szCs w:val="24"/>
+          <w:bdr w:val="single" w:sz="2" w:space="0" w:color="E5E7EB" w:frame="1"/>
+          <w:lang w:eastAsia="ru-RU"/>
+        </w:rPr>
+        <w:t>Сейчас</w:t>
+      </w:r>
+      <w:r>
+        <w:rPr>
+          <w:rFonts w:ascii="Times New Roman" w:eastAsia="Times New Roman" w:hAnsi="Times New Roman" w:cs="Times New Roman"/>
+          <w:sz w:val="24"/>
+          <w:szCs w:val="24"/>
+          <w:bdr w:val="single" w:sz="2" w:space="0" w:color="E5E7EB" w:frame="1"/>
+          <w:lang w:eastAsia="ru-RU"/>
+        </w:rPr>
+        <w:t>: Если VPS перезагрузится или бот упадёт — он </w:t>
+      </w:r>
+      <w:r>
+        <w:rPr>
+          <w:rFonts w:ascii="Times New Roman" w:eastAsia="Times New Roman" w:hAnsi="Times New Roman" w:cs="Times New Roman"/>
+          <w:b/>
+          <w:bCs/>
+          <w:sz w:val="24"/>
+          <w:szCs w:val="24"/>
+          <w:bdr w:val="single" w:sz="2" w:space="0" w:color="E5E7EB" w:frame="1"/>
+          <w:lang w:eastAsia="ru-RU"/>
+        </w:rPr>
+        <w:t>не помнит</w:t>
+      </w:r>
+      <w:r>
+        <w:rPr>
+          <w:rFonts w:ascii="Times New Roman" w:eastAsia="Times New Roman" w:hAnsi="Times New Roman" w:cs="Times New Roman"/>
+          <w:sz w:val="24"/>
+          <w:szCs w:val="24"/>
+          <w:bdr w:val="single" w:sz="2" w:space="0" w:color="E5E7EB" w:frame="1"/>
+          <w:lang w:eastAsia="ru-RU"/>
+        </w:rPr>
+        <w:t> где остановился: какая была последняя цена, сколько сделок сделал за сессию, сколько заработал.</w:t>
+      </w:r>
+    </w:p>
+    <w:p>
+      <w:pPr>
+        <w:pBdr>
+          <w:top w:val="single" w:sz="2" w:space="0" w:color="E5E7EB"/>
+          <w:left w:val="single" w:sz="2" w:space="0" w:color="E5E7EB"/>
+          <w:bottom w:val="single" w:sz="2" w:space="0" w:color="E5E7EB"/>
+          <w:right w:val="single" w:sz="2" w:space="0" w:color="E5E7EB"/>
+        </w:pBdr>
+        <w:spacing w:after="0" w:line="240" w:lineRule="auto"/>
+        <w:rPr>
+          <w:rFonts w:ascii="Times New Roman" w:eastAsia="Times New Roman" w:hAnsi="Times New Roman" w:cs="Times New Roman"/>
+          <w:sz w:val="24"/>
+          <w:szCs w:val="24"/>
+          <w:bdr w:val="single" w:sz="2" w:space="0" w:color="E5E7EB" w:frame="1"/>
+          <w:lang w:eastAsia="ru-RU"/>
+        </w:rPr>
+      </w:pPr>
+      <w:r>
+        <w:rPr>
+          <w:rFonts w:ascii="Times New Roman" w:eastAsia="Times New Roman" w:hAnsi="Times New Roman" w:cs="Times New Roman"/>
+          <w:b/>
+          <w:bCs/>
+          <w:sz w:val="24"/>
+          <w:szCs w:val="24"/>
+          <w:bdr w:val="single" w:sz="2" w:space="0" w:color="E5E7EB" w:frame="1"/>
+          <w:lang w:eastAsia="ru-RU"/>
+        </w:rPr>
+        <w:t>Что исправим</w:t>
+      </w:r>
+      <w:r>
+        <w:rPr>
+          <w:rFonts w:ascii="Times New Roman" w:eastAsia="Times New Roman" w:hAnsi="Times New Roman" w:cs="Times New Roman"/>
+          <w:sz w:val="24"/>
+          <w:szCs w:val="24"/>
+          <w:bdr w:val="single" w:sz="2" w:space="0" w:color="E5E7EB" w:frame="1"/>
+          <w:lang w:eastAsia="ru-RU"/>
+        </w:rPr>
+        <w:t>: Бот будет </w:t>
+      </w:r>
+      <w:r>
+        <w:rPr>
+          <w:rFonts w:ascii="Times New Roman" w:eastAsia="Times New Roman" w:hAnsi="Times New Roman" w:cs="Times New Roman"/>
+          <w:b/>
+          <w:bCs/>
+          <w:sz w:val="24"/>
+          <w:szCs w:val="24"/>
+          <w:bdr w:val="single" w:sz="2" w:space="0" w:color="E5E7EB" w:frame="1"/>
+          <w:lang w:eastAsia="ru-RU"/>
+        </w:rPr>
+        <w:t>сохранять своё состояние</w:t>
+      </w:r>
+      <w:r>
+        <w:rPr>
+          <w:rFonts w:ascii="Times New Roman" w:eastAsia="Times New Roman" w:hAnsi="Times New Roman" w:cs="Times New Roman"/>
+          <w:sz w:val="24"/>
+          <w:szCs w:val="24"/>
+          <w:bdr w:val="single" w:sz="2" w:space="0" w:color="E5E7EB" w:frame="1"/>
+          <w:lang w:eastAsia="ru-RU"/>
+        </w:rPr>
+        <w:t> каждые несколько секунд (как «</w:t>
+      </w:r>
+      <w:proofErr w:type="spellStart"/>
+      <w:r>
+        <w:rPr>
+          <w:rFonts w:ascii="Times New Roman" w:eastAsia="Times New Roman" w:hAnsi="Times New Roman" w:cs="Times New Roman"/>
+          <w:sz w:val="24"/>
+          <w:szCs w:val="24"/>
+          <w:bdr w:val="single" w:sz="2" w:space="0" w:color="E5E7EB" w:frame="1"/>
+          <w:lang w:eastAsia="ru-RU"/>
+        </w:rPr>
+        <w:t>автосохранение</w:t>
+      </w:r>
+      <w:proofErr w:type="spellEnd"/>
+      <w:r>
+        <w:rPr>
+          <w:rFonts w:ascii="Times New Roman" w:eastAsia="Times New Roman" w:hAnsi="Times New Roman" w:cs="Times New Roman"/>
+          <w:sz w:val="24"/>
+          <w:szCs w:val="24"/>
+          <w:bdr w:val="single" w:sz="2" w:space="0" w:color="E5E7EB" w:frame="1"/>
+          <w:lang w:eastAsia="ru-RU"/>
+        </w:rPr>
+        <w:t>» в игре): последнюю цену, количество сделок, прибыль. При рестарте — подхватывает с того места.</w:t>
+      </w:r>
+    </w:p>
+    <w:p>
+      <w:pPr>
+        <w:spacing w:after="0" w:line="240" w:lineRule="auto"/>
+        <w:rPr>
+          <w:rFonts w:ascii="Times New Roman" w:eastAsia="Times New Roman" w:hAnsi="Times New Roman" w:cs="Times New Roman"/>
+          <w:sz w:val="24"/>
+          <w:szCs w:val="24"/>
+          <w:bdr w:val="single" w:sz="2" w:space="0" w:color="E5E7EB" w:frame="1"/>
+          <w:lang w:eastAsia="ru-RU"/>
+        </w:rPr>
+      </w:pPr>
+      <w:r>
+        <w:rPr>
+          <w:rFonts w:ascii="Times New Roman" w:eastAsia="Times New Roman" w:hAnsi="Times New Roman" w:cs="Times New Roman"/>
+          <w:sz w:val="24"/>
+          <w:szCs w:val="24"/>
+          <w:bdr w:val="single" w:sz="2" w:space="0" w:color="E5E7EB" w:frame="1"/>
+          <w:lang w:eastAsia="ru-RU"/>
+        </w:rPr>
+        <w:pict>
+          <v:rect id="_x0000_i1027" style="width:236.25pt;height:.75pt" o:hrpct="0" o:hralign="center" o:hrstd="t" o:hr="t" fillcolor="#a0a0a0" stroked="f"/>
+        </w:pict>
+      </w:r>
+    </w:p>
+    <w:p>
+      <w:pPr>
+        <w:pBdr>
+          <w:top w:val="single" w:sz="2" w:space="0" w:color="E5E7EB"/>
+          <w:left w:val="single" w:sz="2" w:space="0" w:color="E5E7EB"/>
+          <w:bottom w:val="single" w:sz="2" w:space="0" w:color="E5E7EB"/>
+          <w:right w:val="single" w:sz="2" w:space="0" w:color="E5E7EB"/>
+        </w:pBdr>
+        <w:spacing w:before="100" w:beforeAutospacing="1" w:after="100" w:afterAutospacing="1" w:line="240" w:lineRule="auto"/>
+        <w:outlineLvl w:val="2"/>
+        <w:rPr>
+          <w:rFonts w:ascii="Times New Roman" w:eastAsia="Times New Roman" w:hAnsi="Times New Roman" w:cs="Times New Roman"/>
+          <w:sz w:val="27"/>
+          <w:szCs w:val="27"/>
+          <w:bdr w:val="single" w:sz="2" w:space="0" w:color="E5E7EB" w:frame="1"/>
+          <w:lang w:eastAsia="ru-RU"/>
+        </w:rPr>
+      </w:pPr>
+      <w:r>
+        <w:rPr>
+          <w:rFonts w:ascii="Times New Roman" w:eastAsia="Times New Roman" w:hAnsi="Times New Roman" w:cs="Times New Roman"/>
+          <w:sz w:val="27"/>
+          <w:szCs w:val="27"/>
+          <w:bdr w:val="single" w:sz="2" w:space="0" w:color="E5E7EB" w:frame="1"/>
+          <w:lang w:eastAsia="ru-RU"/>
+        </w:rPr>
+        <w:t>3. </w:t>
+      </w:r>
+      <w:proofErr w:type="spellStart"/>
+      <w:r>
+        <w:rPr>
+          <w:rFonts w:ascii="Consolas" w:eastAsia="Times New Roman" w:hAnsi="Consolas" w:cs="Courier New"/>
+          <w:color w:val="9699A8"/>
+          <w:sz w:val="24"/>
+          <w:szCs w:val="24"/>
+          <w:bdr w:val="single" w:sz="2" w:space="0" w:color="E5E7EB" w:frame="1"/>
+          <w:lang w:eastAsia="ru-RU"/>
+        </w:rPr>
+        <w:t>recv_window</w:t>
+      </w:r>
+      <w:proofErr w:type="spellEnd"/>
+      <w:r>
+        <w:rPr>
+          <w:rFonts w:ascii="Times New Roman" w:eastAsia="Times New Roman" w:hAnsi="Times New Roman" w:cs="Times New Roman"/>
+          <w:sz w:val="27"/>
+          <w:szCs w:val="27"/>
+          <w:bdr w:val="single" w:sz="2" w:space="0" w:color="E5E7EB" w:frame="1"/>
+          <w:lang w:eastAsia="ru-RU"/>
+        </w:rPr>
+        <w:t> + NTP — синхронизация часов</w:t>
+      </w:r>
+    </w:p>
+    <w:p>
+      <w:pPr>
+        <w:pBdr>
+          <w:top w:val="single" w:sz="2" w:space="0" w:color="E5E7EB"/>
+          <w:left w:val="single" w:sz="2" w:space="0" w:color="E5E7EB"/>
+          <w:bottom w:val="single" w:sz="2" w:space="0" w:color="E5E7EB"/>
+          <w:right w:val="single" w:sz="2" w:space="0" w:color="E5E7EB"/>
+        </w:pBdr>
+        <w:spacing w:after="0" w:line="240" w:lineRule="auto"/>
+        <w:rPr>
+          <w:rFonts w:ascii="Times New Roman" w:eastAsia="Times New Roman" w:hAnsi="Times New Roman" w:cs="Times New Roman"/>
+          <w:sz w:val="24"/>
+          <w:szCs w:val="24"/>
+          <w:bdr w:val="single" w:sz="2" w:space="0" w:color="E5E7EB" w:frame="1"/>
+          <w:lang w:eastAsia="ru-RU"/>
+        </w:rPr>
+      </w:pPr>
+      <w:r>
+        <w:rPr>
+          <w:rFonts w:ascii="Times New Roman" w:eastAsia="Times New Roman" w:hAnsi="Times New Roman" w:cs="Times New Roman"/>
+          <w:b/>
+          <w:bCs/>
+          <w:sz w:val="24"/>
+          <w:szCs w:val="24"/>
+          <w:bdr w:val="single" w:sz="2" w:space="0" w:color="E5E7EB" w:frame="1"/>
+          <w:lang w:eastAsia="ru-RU"/>
+        </w:rPr>
+        <w:t>Представь</w:t>
+      </w:r>
+      <w:r>
+        <w:rPr>
+          <w:rFonts w:ascii="Times New Roman" w:eastAsia="Times New Roman" w:hAnsi="Times New Roman" w:cs="Times New Roman"/>
+          <w:sz w:val="24"/>
+          <w:szCs w:val="24"/>
+          <w:bdr w:val="single" w:sz="2" w:space="0" w:color="E5E7EB" w:frame="1"/>
+          <w:lang w:eastAsia="ru-RU"/>
+        </w:rPr>
+        <w:t>: Ты звонишь другу и говоришь «Встретимся в 15:00». У тебя на часах 14:55, а у него 14:58. Вы придёте в разное время!</w:t>
+      </w:r>
+    </w:p>
+    <w:p>
+      <w:pPr>
+        <w:pBdr>
+          <w:top w:val="single" w:sz="2" w:space="0" w:color="E5E7EB"/>
+          <w:left w:val="single" w:sz="2" w:space="0" w:color="E5E7EB"/>
+          <w:bottom w:val="single" w:sz="2" w:space="0" w:color="E5E7EB"/>
+          <w:right w:val="single" w:sz="2" w:space="0" w:color="E5E7EB"/>
+        </w:pBdr>
+        <w:spacing w:after="0" w:line="240" w:lineRule="auto"/>
+        <w:rPr>
+          <w:rFonts w:ascii="Times New Roman" w:eastAsia="Times New Roman" w:hAnsi="Times New Roman" w:cs="Times New Roman"/>
+          <w:sz w:val="24"/>
+          <w:szCs w:val="24"/>
+          <w:bdr w:val="single" w:sz="2" w:space="0" w:color="E5E7EB" w:frame="1"/>
+          <w:lang w:eastAsia="ru-RU"/>
+        </w:rPr>
+      </w:pPr>
+      <w:r>
+        <w:rPr>
+          <w:rFonts w:ascii="Times New Roman" w:eastAsia="Times New Roman" w:hAnsi="Times New Roman" w:cs="Times New Roman"/>
+          <w:b/>
+          <w:bCs/>
+          <w:sz w:val="24"/>
+          <w:szCs w:val="24"/>
+          <w:bdr w:val="single" w:sz="2" w:space="0" w:color="E5E7EB" w:frame="1"/>
+          <w:lang w:eastAsia="ru-RU"/>
+        </w:rPr>
+        <w:t>Сейчас</w:t>
+      </w:r>
+      <w:r>
+        <w:rPr>
+          <w:rFonts w:ascii="Times New Roman" w:eastAsia="Times New Roman" w:hAnsi="Times New Roman" w:cs="Times New Roman"/>
+          <w:sz w:val="24"/>
+          <w:szCs w:val="24"/>
+          <w:bdr w:val="single" w:sz="2" w:space="0" w:color="E5E7EB" w:frame="1"/>
+          <w:lang w:eastAsia="ru-RU"/>
+        </w:rPr>
+        <w:t xml:space="preserve">: Бот отправляет запрос на биржу </w:t>
+      </w:r>
+      <w:proofErr w:type="spellStart"/>
+      <w:r>
+        <w:rPr>
+          <w:rFonts w:ascii="Times New Roman" w:eastAsia="Times New Roman" w:hAnsi="Times New Roman" w:cs="Times New Roman"/>
+          <w:sz w:val="24"/>
+          <w:szCs w:val="24"/>
+          <w:bdr w:val="single" w:sz="2" w:space="0" w:color="E5E7EB" w:frame="1"/>
+          <w:lang w:eastAsia="ru-RU"/>
+        </w:rPr>
+        <w:t>Bybit</w:t>
+      </w:r>
+      <w:proofErr w:type="spellEnd"/>
+      <w:r>
+        <w:rPr>
+          <w:rFonts w:ascii="Times New Roman" w:eastAsia="Times New Roman" w:hAnsi="Times New Roman" w:cs="Times New Roman"/>
+          <w:sz w:val="24"/>
+          <w:szCs w:val="24"/>
+          <w:bdr w:val="single" w:sz="2" w:space="0" w:color="E5E7EB" w:frame="1"/>
+          <w:lang w:eastAsia="ru-RU"/>
+        </w:rPr>
+        <w:t xml:space="preserve">. В запросе есть метка времени — «отправлено в 16:00:00». </w:t>
+      </w:r>
+      <w:proofErr w:type="spellStart"/>
+      <w:r>
+        <w:rPr>
+          <w:rFonts w:ascii="Times New Roman" w:eastAsia="Times New Roman" w:hAnsi="Times New Roman" w:cs="Times New Roman"/>
+          <w:sz w:val="24"/>
+          <w:szCs w:val="24"/>
+          <w:bdr w:val="single" w:sz="2" w:space="0" w:color="E5E7EB" w:frame="1"/>
+          <w:lang w:eastAsia="ru-RU"/>
+        </w:rPr>
+        <w:t>Bybit</w:t>
+      </w:r>
+      <w:proofErr w:type="spellEnd"/>
+      <w:r>
+        <w:rPr>
+          <w:rFonts w:ascii="Times New Roman" w:eastAsia="Times New Roman" w:hAnsi="Times New Roman" w:cs="Times New Roman"/>
+          <w:sz w:val="24"/>
+          <w:szCs w:val="24"/>
+          <w:bdr w:val="single" w:sz="2" w:space="0" w:color="E5E7EB" w:frame="1"/>
+          <w:lang w:eastAsia="ru-RU"/>
+        </w:rPr>
+        <w:t xml:space="preserve"> смотрит на свои часы и видит «16:00:01» — разница 1 секунда. </w:t>
+      </w:r>
+      <w:proofErr w:type="spellStart"/>
+      <w:r>
+        <w:rPr>
+          <w:rFonts w:ascii="Times New Roman" w:eastAsia="Times New Roman" w:hAnsi="Times New Roman" w:cs="Times New Roman"/>
+          <w:sz w:val="24"/>
+          <w:szCs w:val="24"/>
+          <w:bdr w:val="single" w:sz="2" w:space="0" w:color="E5E7EB" w:frame="1"/>
+          <w:lang w:eastAsia="ru-RU"/>
+        </w:rPr>
+        <w:t>Bybit</w:t>
+      </w:r>
+      <w:proofErr w:type="spellEnd"/>
+      <w:r>
+        <w:rPr>
+          <w:rFonts w:ascii="Times New Roman" w:eastAsia="Times New Roman" w:hAnsi="Times New Roman" w:cs="Times New Roman"/>
+          <w:sz w:val="24"/>
+          <w:szCs w:val="24"/>
+          <w:bdr w:val="single" w:sz="2" w:space="0" w:color="E5E7EB" w:frame="1"/>
+          <w:lang w:eastAsia="ru-RU"/>
+        </w:rPr>
+        <w:t xml:space="preserve"> разрешает разницу до 20 секунд (</w:t>
+      </w:r>
+      <w:proofErr w:type="spellStart"/>
+      <w:r>
+        <w:rPr>
+          <w:rFonts w:ascii="Consolas" w:eastAsia="Times New Roman" w:hAnsi="Consolas" w:cs="Courier New"/>
+          <w:color w:val="9699A8"/>
+          <w:bdr w:val="single" w:sz="2" w:space="0" w:color="E5E7EB" w:frame="1"/>
+          <w:lang w:eastAsia="ru-RU"/>
+        </w:rPr>
+        <w:t>recv_window</w:t>
+      </w:r>
+      <w:proofErr w:type="spellEnd"/>
+      <w:r>
+        <w:rPr>
+          <w:rFonts w:ascii="Consolas" w:eastAsia="Times New Roman" w:hAnsi="Consolas" w:cs="Courier New"/>
+          <w:color w:val="9699A8"/>
+          <w:bdr w:val="single" w:sz="2" w:space="0" w:color="E5E7EB" w:frame="1"/>
+          <w:lang w:eastAsia="ru-RU"/>
+        </w:rPr>
+        <w:t>=20000</w:t>
+      </w:r>
+      <w:r>
+        <w:rPr>
+          <w:rFonts w:ascii="Times New Roman" w:eastAsia="Times New Roman" w:hAnsi="Times New Roman" w:cs="Times New Roman"/>
+          <w:sz w:val="24"/>
+          <w:szCs w:val="24"/>
+          <w:bdr w:val="single" w:sz="2" w:space="0" w:color="E5E7EB" w:frame="1"/>
+          <w:lang w:eastAsia="ru-RU"/>
+        </w:rPr>
+        <w:t> </w:t>
+      </w:r>
+      <w:proofErr w:type="spellStart"/>
+      <w:r>
+        <w:rPr>
+          <w:rFonts w:ascii="Times New Roman" w:eastAsia="Times New Roman" w:hAnsi="Times New Roman" w:cs="Times New Roman"/>
+          <w:sz w:val="24"/>
+          <w:szCs w:val="24"/>
+          <w:bdr w:val="single" w:sz="2" w:space="0" w:color="E5E7EB" w:frame="1"/>
+          <w:lang w:eastAsia="ru-RU"/>
+        </w:rPr>
+        <w:t>мс</w:t>
+      </w:r>
+      <w:proofErr w:type="spellEnd"/>
+      <w:r>
+        <w:rPr>
+          <w:rFonts w:ascii="Times New Roman" w:eastAsia="Times New Roman" w:hAnsi="Times New Roman" w:cs="Times New Roman"/>
+          <w:sz w:val="24"/>
+          <w:szCs w:val="24"/>
+          <w:bdr w:val="single" w:sz="2" w:space="0" w:color="E5E7EB" w:frame="1"/>
+          <w:lang w:eastAsia="ru-RU"/>
+        </w:rPr>
+        <w:t xml:space="preserve">). Но иногда часы на VPS уходят дальше → </w:t>
+      </w:r>
+      <w:proofErr w:type="spellStart"/>
+      <w:r>
+        <w:rPr>
+          <w:rFonts w:ascii="Times New Roman" w:eastAsia="Times New Roman" w:hAnsi="Times New Roman" w:cs="Times New Roman"/>
+          <w:sz w:val="24"/>
+          <w:szCs w:val="24"/>
+          <w:bdr w:val="single" w:sz="2" w:space="0" w:color="E5E7EB" w:frame="1"/>
+          <w:lang w:eastAsia="ru-RU"/>
+        </w:rPr>
+        <w:t>Bybit</w:t>
+      </w:r>
+      <w:proofErr w:type="spellEnd"/>
+      <w:r>
+        <w:rPr>
+          <w:rFonts w:ascii="Times New Roman" w:eastAsia="Times New Roman" w:hAnsi="Times New Roman" w:cs="Times New Roman"/>
+          <w:sz w:val="24"/>
+          <w:szCs w:val="24"/>
+          <w:bdr w:val="single" w:sz="2" w:space="0" w:color="E5E7EB" w:frame="1"/>
+          <w:lang w:eastAsia="ru-RU"/>
+        </w:rPr>
+        <w:t xml:space="preserve"> отвечает: </w:t>
+      </w:r>
+      <w:r>
+        <w:rPr>
+          <w:rFonts w:ascii="Times New Roman" w:eastAsia="Times New Roman" w:hAnsi="Times New Roman" w:cs="Times New Roman"/>
+          <w:b/>
+          <w:bCs/>
+          <w:sz w:val="24"/>
+          <w:szCs w:val="24"/>
+          <w:bdr w:val="single" w:sz="2" w:space="0" w:color="E5E7EB" w:frame="1"/>
+          <w:lang w:eastAsia="ru-RU"/>
+        </w:rPr>
+        <w:t>«Время не совпадает, отказ!»</w:t>
+      </w:r>
+      <w:r>
+        <w:rPr>
+          <w:rFonts w:ascii="Times New Roman" w:eastAsia="Times New Roman" w:hAnsi="Times New Roman" w:cs="Times New Roman"/>
+          <w:sz w:val="24"/>
+          <w:szCs w:val="24"/>
+          <w:bdr w:val="single" w:sz="2" w:space="0" w:color="E5E7EB" w:frame="1"/>
+          <w:lang w:eastAsia="ru-RU"/>
+        </w:rPr>
+        <w:t> (</w:t>
+      </w:r>
+      <w:proofErr w:type="gramStart"/>
+      <w:r>
+        <w:rPr>
+          <w:rFonts w:ascii="Times New Roman" w:eastAsia="Times New Roman" w:hAnsi="Times New Roman" w:cs="Times New Roman"/>
+          <w:sz w:val="24"/>
+          <w:szCs w:val="24"/>
+          <w:bdr w:val="single" w:sz="2" w:space="0" w:color="E5E7EB" w:frame="1"/>
+          <w:lang w:eastAsia="ru-RU"/>
+        </w:rPr>
+        <w:t>ошибка</w:t>
+      </w:r>
+      <w:proofErr w:type="gramEnd"/>
+      <w:r>
+        <w:rPr>
+          <w:rFonts w:ascii="Times New Roman" w:eastAsia="Times New Roman" w:hAnsi="Times New Roman" w:cs="Times New Roman"/>
+          <w:sz w:val="24"/>
+          <w:szCs w:val="24"/>
+          <w:bdr w:val="single" w:sz="2" w:space="0" w:color="E5E7EB" w:frame="1"/>
+          <w:lang w:eastAsia="ru-RU"/>
+        </w:rPr>
+        <w:t xml:space="preserve"> 10002).</w:t>
+      </w:r>
+    </w:p>
+    <w:p>
+      <w:pPr>
+        <w:pBdr>
+          <w:top w:val="single" w:sz="2" w:space="0" w:color="E5E7EB"/>
+          <w:left w:val="single" w:sz="2" w:space="0" w:color="E5E7EB"/>
+          <w:bottom w:val="single" w:sz="2" w:space="0" w:color="E5E7EB"/>
+          <w:right w:val="single" w:sz="2" w:space="0" w:color="E5E7EB"/>
+        </w:pBdr>
+        <w:spacing w:after="0" w:line="240" w:lineRule="auto"/>
+        <w:rPr>
+          <w:rFonts w:ascii="Times New Roman" w:eastAsia="Times New Roman" w:hAnsi="Times New Roman" w:cs="Times New Roman"/>
+          <w:sz w:val="24"/>
+          <w:szCs w:val="24"/>
+          <w:bdr w:val="single" w:sz="2" w:space="0" w:color="E5E7EB" w:frame="1"/>
+          <w:lang w:eastAsia="ru-RU"/>
+        </w:rPr>
+      </w:pPr>
+      <w:r>
+        <w:rPr>
+          <w:rFonts w:ascii="Times New Roman" w:eastAsia="Times New Roman" w:hAnsi="Times New Roman" w:cs="Times New Roman"/>
+          <w:b/>
+          <w:bCs/>
+          <w:sz w:val="24"/>
+          <w:szCs w:val="24"/>
+          <w:bdr w:val="single" w:sz="2" w:space="0" w:color="E5E7EB" w:frame="1"/>
+          <w:lang w:eastAsia="ru-RU"/>
+        </w:rPr>
+        <w:t>Что исправим</w:t>
+      </w:r>
+      <w:r>
+        <w:rPr>
+          <w:rFonts w:ascii="Times New Roman" w:eastAsia="Times New Roman" w:hAnsi="Times New Roman" w:cs="Times New Roman"/>
+          <w:sz w:val="24"/>
+          <w:szCs w:val="24"/>
+          <w:bdr w:val="single" w:sz="2" w:space="0" w:color="E5E7EB" w:frame="1"/>
+          <w:lang w:eastAsia="ru-RU"/>
+        </w:rPr>
+        <w:t>:</w:t>
+      </w:r>
+    </w:p>
+    <w:p>
+      <w:pPr>
+        <w:numPr>
+          <w:ilvl w:val="0"/>
+          <w:numId w:val="2"/>
+        </w:numPr>
+        <w:pBdr>
+          <w:top w:val="single" w:sz="2" w:space="0" w:color="E5E7EB"/>
+          <w:left w:val="single" w:sz="2" w:space="0" w:color="E5E7EB"/>
+          <w:bottom w:val="single" w:sz="2" w:space="0" w:color="E5E7EB"/>
+          <w:right w:val="single" w:sz="2" w:space="0" w:color="E5E7EB"/>
+        </w:pBdr>
+        <w:spacing w:before="100" w:beforeAutospacing="1" w:after="100" w:afterAutospacing="1" w:line="240" w:lineRule="auto"/>
+        <w:rPr>
+          <w:rFonts w:ascii="Times New Roman" w:eastAsia="Times New Roman" w:hAnsi="Times New Roman" w:cs="Times New Roman"/>
+          <w:sz w:val="24"/>
+          <w:szCs w:val="24"/>
+          <w:bdr w:val="single" w:sz="2" w:space="0" w:color="E5E7EB" w:frame="1"/>
+          <w:lang w:eastAsia="ru-RU"/>
+        </w:rPr>
+      </w:pPr>
+      <w:proofErr w:type="spellStart"/>
+      <w:proofErr w:type="gramStart"/>
+      <w:r>
+        <w:rPr>
+          <w:rFonts w:ascii="Consolas" w:eastAsia="Times New Roman" w:hAnsi="Consolas" w:cs="Courier New"/>
+          <w:b/>
+          <w:bCs/>
+          <w:color w:val="9699A8"/>
+          <w:bdr w:val="single" w:sz="2" w:space="0" w:color="E5E7EB" w:frame="1"/>
+          <w:lang w:eastAsia="ru-RU"/>
+        </w:rPr>
+        <w:t>recv</w:t>
+      </w:r>
+      <w:proofErr w:type="gramEnd"/>
+      <w:r>
+        <w:rPr>
+          <w:rFonts w:ascii="Consolas" w:eastAsia="Times New Roman" w:hAnsi="Consolas" w:cs="Courier New"/>
+          <w:b/>
+          <w:bCs/>
+          <w:color w:val="9699A8"/>
+          <w:bdr w:val="single" w:sz="2" w:space="0" w:color="E5E7EB" w:frame="1"/>
+          <w:lang w:eastAsia="ru-RU"/>
+        </w:rPr>
+        <w:t>_window</w:t>
+      </w:r>
+      <w:proofErr w:type="spellEnd"/>
+      <w:r>
+        <w:rPr>
+          <w:rFonts w:ascii="Consolas" w:eastAsia="Times New Roman" w:hAnsi="Consolas" w:cs="Courier New"/>
+          <w:b/>
+          <w:bCs/>
+          <w:color w:val="9699A8"/>
+          <w:bdr w:val="single" w:sz="2" w:space="0" w:color="E5E7EB" w:frame="1"/>
+          <w:lang w:eastAsia="ru-RU"/>
+        </w:rPr>
+        <w:t>=30000</w:t>
+      </w:r>
+      <w:r>
+        <w:rPr>
+          <w:rFonts w:ascii="Times New Roman" w:eastAsia="Times New Roman" w:hAnsi="Times New Roman" w:cs="Times New Roman"/>
+          <w:sz w:val="24"/>
+          <w:szCs w:val="24"/>
+          <w:bdr w:val="single" w:sz="2" w:space="0" w:color="E5E7EB" w:frame="1"/>
+          <w:lang w:eastAsia="ru-RU"/>
+        </w:rPr>
+        <w:t> — увеличиваем допуск с 20 до 30 секунд (как сказать другу «плюс-минус 30 секунд — нормально»)</w:t>
+      </w:r>
+    </w:p>
+    <w:p>
+      <w:pPr>
+        <w:numPr>
+          <w:ilvl w:val="0"/>
+          <w:numId w:val="2"/>
+        </w:numPr>
+        <w:pBdr>
+          <w:top w:val="single" w:sz="2" w:space="0" w:color="E5E7EB"/>
+          <w:left w:val="single" w:sz="2" w:space="0" w:color="E5E7EB"/>
+          <w:bottom w:val="single" w:sz="2" w:space="0" w:color="E5E7EB"/>
+          <w:right w:val="single" w:sz="2" w:space="0" w:color="E5E7EB"/>
+        </w:pBdr>
+        <w:spacing w:before="100" w:beforeAutospacing="1" w:after="100" w:afterAutospacing="1" w:line="240" w:lineRule="auto"/>
+        <w:rPr>
+          <w:rFonts w:ascii="Times New Roman" w:eastAsia="Times New Roman" w:hAnsi="Times New Roman" w:cs="Times New Roman"/>
+          <w:sz w:val="24"/>
+          <w:szCs w:val="24"/>
+          <w:bdr w:val="single" w:sz="2" w:space="0" w:color="E5E7EB" w:frame="1"/>
+          <w:lang w:eastAsia="ru-RU"/>
+        </w:rPr>
+      </w:pPr>
+      <w:r>
+        <w:rPr>
+          <w:rFonts w:ascii="Times New Roman" w:eastAsia="Times New Roman" w:hAnsi="Times New Roman" w:cs="Times New Roman"/>
+          <w:b/>
+          <w:bCs/>
+          <w:sz w:val="24"/>
+          <w:szCs w:val="24"/>
+          <w:bdr w:val="single" w:sz="2" w:space="0" w:color="E5E7EB" w:frame="1"/>
+          <w:lang w:eastAsia="ru-RU"/>
+        </w:rPr>
+        <w:t>NTP на VPS</w:t>
+      </w:r>
+      <w:r>
+        <w:rPr>
+          <w:rFonts w:ascii="Times New Roman" w:eastAsia="Times New Roman" w:hAnsi="Times New Roman" w:cs="Times New Roman"/>
+          <w:sz w:val="24"/>
+          <w:szCs w:val="24"/>
+          <w:bdr w:val="single" w:sz="2" w:space="0" w:color="E5E7EB" w:frame="1"/>
+          <w:lang w:eastAsia="ru-RU"/>
+        </w:rPr>
+        <w:t> — это программа, которая </w:t>
+      </w:r>
+      <w:r>
+        <w:rPr>
+          <w:rFonts w:ascii="Times New Roman" w:eastAsia="Times New Roman" w:hAnsi="Times New Roman" w:cs="Times New Roman"/>
+          <w:b/>
+          <w:bCs/>
+          <w:sz w:val="24"/>
+          <w:szCs w:val="24"/>
+          <w:bdr w:val="single" w:sz="2" w:space="0" w:color="E5E7EB" w:frame="1"/>
+          <w:lang w:eastAsia="ru-RU"/>
+        </w:rPr>
+        <w:t>автоматически подводит часы</w:t>
+      </w:r>
+      <w:r>
+        <w:rPr>
+          <w:rFonts w:ascii="Times New Roman" w:eastAsia="Times New Roman" w:hAnsi="Times New Roman" w:cs="Times New Roman"/>
+          <w:sz w:val="24"/>
+          <w:szCs w:val="24"/>
+          <w:bdr w:val="single" w:sz="2" w:space="0" w:color="E5E7EB" w:frame="1"/>
+          <w:lang w:eastAsia="ru-RU"/>
+        </w:rPr>
+        <w:t xml:space="preserve"> сервера по интернету (как часы, которые сами синхронизируются через </w:t>
+      </w:r>
+      <w:proofErr w:type="spellStart"/>
+      <w:r>
+        <w:rPr>
+          <w:rFonts w:ascii="Times New Roman" w:eastAsia="Times New Roman" w:hAnsi="Times New Roman" w:cs="Times New Roman"/>
+          <w:sz w:val="24"/>
+          <w:szCs w:val="24"/>
+          <w:bdr w:val="single" w:sz="2" w:space="0" w:color="E5E7EB" w:frame="1"/>
+          <w:lang w:eastAsia="ru-RU"/>
+        </w:rPr>
+        <w:t>Wi-Fi</w:t>
+      </w:r>
+      <w:proofErr w:type="spellEnd"/>
+      <w:r>
+        <w:rPr>
+          <w:rFonts w:ascii="Times New Roman" w:eastAsia="Times New Roman" w:hAnsi="Times New Roman" w:cs="Times New Roman"/>
+          <w:sz w:val="24"/>
+          <w:szCs w:val="24"/>
+          <w:bdr w:val="single" w:sz="2" w:space="0" w:color="E5E7EB" w:frame="1"/>
+          <w:lang w:eastAsia="ru-RU"/>
+        </w:rPr>
+        <w:t xml:space="preserve">). После этого разница будет </w:t>
+      </w:r>
+      <w:proofErr w:type="gramStart"/>
+      <w:r>
+        <w:rPr>
+          <w:rFonts w:ascii="Times New Roman" w:eastAsia="Times New Roman" w:hAnsi="Times New Roman" w:cs="Times New Roman"/>
+          <w:sz w:val="24"/>
+          <w:szCs w:val="24"/>
+          <w:bdr w:val="single" w:sz="2" w:space="0" w:color="E5E7EB" w:frame="1"/>
+          <w:lang w:eastAsia="ru-RU"/>
+        </w:rPr>
+        <w:t>&lt; 0.1</w:t>
+      </w:r>
+      <w:proofErr w:type="gramEnd"/>
+      <w:r>
+        <w:rPr>
+          <w:rFonts w:ascii="Times New Roman" w:eastAsia="Times New Roman" w:hAnsi="Times New Roman" w:cs="Times New Roman"/>
+          <w:sz w:val="24"/>
+          <w:szCs w:val="24"/>
+          <w:bdr w:val="single" w:sz="2" w:space="0" w:color="E5E7EB" w:frame="1"/>
+          <w:lang w:eastAsia="ru-RU"/>
+        </w:rPr>
+        <w:t xml:space="preserve"> секунды.</w:t>
+      </w:r>
+    </w:p>
+    <w:p>
+      <w:pPr>
+        <w:spacing w:after="0" w:line="240" w:lineRule="auto"/>
+        <w:rPr>
+          <w:rFonts w:ascii="Times New Roman" w:eastAsia="Times New Roman" w:hAnsi="Times New Roman" w:cs="Times New Roman"/>
+          <w:sz w:val="24"/>
+          <w:szCs w:val="24"/>
+          <w:bdr w:val="single" w:sz="2" w:space="0" w:color="E5E7EB" w:frame="1"/>
+          <w:lang w:eastAsia="ru-RU"/>
+        </w:rPr>
+      </w:pPr>
+      <w:r>
+        <w:rPr>
+          <w:rFonts w:ascii="Times New Roman" w:eastAsia="Times New Roman" w:hAnsi="Times New Roman" w:cs="Times New Roman"/>
+          <w:sz w:val="24"/>
+          <w:szCs w:val="24"/>
+          <w:bdr w:val="single" w:sz="2" w:space="0" w:color="E5E7EB" w:frame="1"/>
+          <w:lang w:eastAsia="ru-RU"/>
+        </w:rPr>
+        <w:pict>
+          <v:rect id="_x0000_i1028" style="width:236.25pt;height:.75pt" o:hrpct="0" o:hralign="center" o:hrstd="t" o:hr="t" fillcolor="#a0a0a0" stroked="f"/>
+        </w:pict>
+      </w:r>
+    </w:p>
+    <w:p>
+      <w:pPr>
+        <w:pBdr>
+          <w:top w:val="single" w:sz="2" w:space="0" w:color="E5E7EB"/>
+          <w:left w:val="single" w:sz="2" w:space="0" w:color="E5E7EB"/>
+          <w:bottom w:val="single" w:sz="2" w:space="0" w:color="E5E7EB"/>
+          <w:right w:val="single" w:sz="2" w:space="0" w:color="E5E7EB"/>
+        </w:pBdr>
+        <w:spacing w:after="0" w:line="240" w:lineRule="auto"/>
+        <w:rPr>
+          <w:rFonts w:ascii="Times New Roman" w:eastAsia="Times New Roman" w:hAnsi="Times New Roman" w:cs="Times New Roman"/>
+          <w:sz w:val="24"/>
+          <w:szCs w:val="24"/>
+          <w:bdr w:val="single" w:sz="2" w:space="0" w:color="E5E7EB" w:frame="1"/>
+          <w:lang w:eastAsia="ru-RU"/>
+        </w:rPr>
+      </w:pPr>
+      <w:r>
+        <w:rPr>
+          <w:rFonts w:ascii="Times New Roman" w:eastAsia="Times New Roman" w:hAnsi="Times New Roman" w:cs="Times New Roman"/>
+          <w:sz w:val="24"/>
+          <w:szCs w:val="24"/>
+          <w:bdr w:val="single" w:sz="2" w:space="0" w:color="E5E7EB" w:frame="1"/>
+          <w:lang w:eastAsia="ru-RU"/>
+        </w:rPr>
+        <w:t>Если коротко: </w:t>
+      </w:r>
+      <w:r>
+        <w:rPr>
+          <w:rFonts w:ascii="Times New Roman" w:eastAsia="Times New Roman" w:hAnsi="Times New Roman" w:cs="Times New Roman"/>
+          <w:b/>
+          <w:bCs/>
+          <w:sz w:val="24"/>
+          <w:szCs w:val="24"/>
+          <w:bdr w:val="single" w:sz="2" w:space="0" w:color="E5E7EB" w:frame="1"/>
+          <w:lang w:eastAsia="ru-RU"/>
+        </w:rPr>
+        <w:t>тетрадка</w:t>
+      </w:r>
+      <w:r>
+        <w:rPr>
+          <w:rFonts w:ascii="Times New Roman" w:eastAsia="Times New Roman" w:hAnsi="Times New Roman" w:cs="Times New Roman"/>
+          <w:sz w:val="24"/>
+          <w:szCs w:val="24"/>
+          <w:bdr w:val="single" w:sz="2" w:space="0" w:color="E5E7EB" w:frame="1"/>
+          <w:lang w:eastAsia="ru-RU"/>
+        </w:rPr>
+        <w:t> + </w:t>
+      </w:r>
+      <w:proofErr w:type="spellStart"/>
+      <w:r>
+        <w:rPr>
+          <w:rFonts w:ascii="Times New Roman" w:eastAsia="Times New Roman" w:hAnsi="Times New Roman" w:cs="Times New Roman"/>
+          <w:b/>
+          <w:bCs/>
+          <w:sz w:val="24"/>
+          <w:szCs w:val="24"/>
+          <w:bdr w:val="single" w:sz="2" w:space="0" w:color="E5E7EB" w:frame="1"/>
+          <w:lang w:eastAsia="ru-RU"/>
+        </w:rPr>
+        <w:t>автосохранение</w:t>
+      </w:r>
+      <w:proofErr w:type="spellEnd"/>
+      <w:r>
+        <w:rPr>
+          <w:rFonts w:ascii="Times New Roman" w:eastAsia="Times New Roman" w:hAnsi="Times New Roman" w:cs="Times New Roman"/>
+          <w:sz w:val="24"/>
+          <w:szCs w:val="24"/>
+          <w:bdr w:val="single" w:sz="2" w:space="0" w:color="E5E7EB" w:frame="1"/>
+          <w:lang w:eastAsia="ru-RU"/>
+        </w:rPr>
+        <w:t> + </w:t>
+      </w:r>
+      <w:r>
+        <w:rPr>
+          <w:rFonts w:ascii="Times New Roman" w:eastAsia="Times New Roman" w:hAnsi="Times New Roman" w:cs="Times New Roman"/>
+          <w:b/>
+          <w:bCs/>
+          <w:sz w:val="24"/>
+          <w:szCs w:val="24"/>
+          <w:bdr w:val="single" w:sz="2" w:space="0" w:color="E5E7EB" w:frame="1"/>
+          <w:lang w:eastAsia="ru-RU"/>
+        </w:rPr>
+        <w:t>синхронизация часов</w:t>
+      </w:r>
+      <w:r>
+        <w:rPr>
+          <w:rFonts w:ascii="Times New Roman" w:eastAsia="Times New Roman" w:hAnsi="Times New Roman" w:cs="Times New Roman"/>
+          <w:sz w:val="24"/>
+          <w:szCs w:val="24"/>
+          <w:bdr w:val="single" w:sz="2" w:space="0" w:color="E5E7EB" w:frame="1"/>
+          <w:lang w:eastAsia="ru-RU"/>
+        </w:rPr>
+        <w:t> </w:t>
+      </w:r>
+      <w:r>
+        <w:rPr>
+          <w:rFonts w:ascii="Segoe UI Symbol" w:eastAsia="Times New Roman" w:hAnsi="Segoe UI Symbol" w:cs="Segoe UI Symbol"/>
+          <w:sz w:val="24"/>
+          <w:szCs w:val="24"/>
+          <w:bdr w:val="single" w:sz="2" w:space="0" w:color="E5E7EB" w:frame="1"/>
+          <w:lang w:eastAsia="ru-RU"/>
+        </w:rPr>
+        <w:t>😊</w:t>
+      </w:r>
+    </w:p>
+    <w:p>
+      <w:pPr>
+        <w:pBdr>
+          <w:top w:val="single" w:sz="2" w:space="0" w:color="E5E7EB"/>
+          <w:left w:val="single" w:sz="2" w:space="0" w:color="E5E7EB"/>
+          <w:bottom w:val="single" w:sz="2" w:space="0" w:color="E5E7EB"/>
+          <w:right w:val="single" w:sz="2" w:space="0" w:color="E5E7EB"/>
+        </w:pBdr>
+        <w:spacing w:after="0" w:line="240" w:lineRule="auto"/>
+        <w:rPr>
+          <w:rFonts w:ascii="Times New Roman" w:eastAsia="Times New Roman" w:hAnsi="Times New Roman" w:cs="Times New Roman"/>
+          <w:sz w:val="24"/>
+          <w:szCs w:val="24"/>
+          <w:bdr w:val="single" w:sz="2" w:space="0" w:color="E5E7EB" w:frame="1"/>
+          <w:lang w:eastAsia="ru-RU"/>
+        </w:rPr>
+      </w:pPr>
+      <w:r>
+        <w:rPr>
+          <w:rFonts w:ascii="Times New Roman" w:eastAsia="Times New Roman" w:hAnsi="Times New Roman" w:cs="Times New Roman"/>
+          <w:sz w:val="24"/>
+          <w:szCs w:val="24"/>
+          <w:bdr w:val="single" w:sz="2" w:space="0" w:color="E5E7EB" w:frame="1"/>
+          <w:lang w:eastAsia="ru-RU"/>
+        </w:rPr>
+        <w:t>Начинаем исправлять?</w:t>
       </w:r>
     </w:p>
     <w:p>
@@ -1017,6 +2615,155 @@
 <file path=word/numbering.xml><?xml version="1.0" encoding="utf-8"?>
 <w:numbering xmlns:wpc="http://schemas.microsoft.com/office/word/2010/wordprocessingCanvas" xmlns:mc="http://schemas.openxmlformats.org/markup-compatibility/2006" xmlns:o="urn:schemas-microsoft-com:office:office" xmlns:r="http://schemas.openxmlformats.org/officeDocument/2006/relationships" xmlns:m="http://schemas.openxmlformats.org/officeDocument/2006/math" xmlns:v="urn:schemas-microsoft-com:vml" xmlns:wp14="http://schemas.microsoft.com/office/word/2010/wordprocessingDrawing" xmlns:wp="http://schemas.openxmlformats.org/drawingml/2006/wordprocessingDrawing" xmlns:w10="urn:schemas-microsoft-com:office:word" xmlns:w="http://schemas.openxmlformats.org/wordprocessingml/2006/main" xmlns:w14="http://schemas.microsoft.com/office/word/2010/wordml" xmlns:w15="http://schemas.microsoft.com/office/word/2012/wordml" xmlns:wpg="http://schemas.microsoft.com/office/word/2010/wordprocessingGroup" xmlns:wpi="http://schemas.microsoft.com/office/word/2010/wordprocessingInk" xmlns:wne="http://schemas.microsoft.com/office/word/2006/wordml" xmlns:wps="http://schemas.microsoft.com/office/word/2010/wordprocessingShape" mc:Ignorable="w14 w15 wp14">
   <w:abstractNum w:abstractNumId="0">
+    <w:nsid w:val="5B0A6865"/>
+    <w:multiLevelType w:val="multilevel"/>
+    <w:tmpl w:val="8D00CACE"/>
+    <w:lvl w:ilvl="0">
+      <w:start w:val="1"/>
+      <w:numFmt w:val="bullet"/>
+      <w:lvlText w:val=""/>
+      <w:lvlJc w:val="left"/>
+      <w:pPr>
+        <w:tabs>
+          <w:tab w:val="num" w:pos="720"/>
+        </w:tabs>
+        <w:ind w:left="720" w:hanging="360"/>
+      </w:pPr>
+      <w:rPr>
+        <w:rFonts w:ascii="Symbol" w:hAnsi="Symbol" w:hint="default"/>
+        <w:sz w:val="20"/>
+      </w:rPr>
+    </w:lvl>
+    <w:lvl w:ilvl="1" w:tentative="1">
+      <w:start w:val="1"/>
+      <w:numFmt w:val="bullet"/>
+      <w:lvlText w:val=""/>
+      <w:lvlJc w:val="left"/>
+      <w:pPr>
+        <w:tabs>
+          <w:tab w:val="num" w:pos="1440"/>
+        </w:tabs>
+        <w:ind w:left="1440" w:hanging="360"/>
+      </w:pPr>
+      <w:rPr>
+        <w:rFonts w:ascii="Symbol" w:hAnsi="Symbol" w:hint="default"/>
+        <w:sz w:val="20"/>
+      </w:rPr>
+    </w:lvl>
+    <w:lvl w:ilvl="2" w:tentative="1">
+      <w:start w:val="1"/>
+      <w:numFmt w:val="bullet"/>
+      <w:lvlText w:val=""/>
+      <w:lvlJc w:val="left"/>
+      <w:pPr>
+        <w:tabs>
+          <w:tab w:val="num" w:pos="2160"/>
+        </w:tabs>
+        <w:ind w:left="2160" w:hanging="360"/>
+      </w:pPr>
+      <w:rPr>
+        <w:rFonts w:ascii="Symbol" w:hAnsi="Symbol" w:hint="default"/>
+        <w:sz w:val="20"/>
+      </w:rPr>
+    </w:lvl>
+    <w:lvl w:ilvl="3" w:tentative="1">
+      <w:start w:val="1"/>
+      <w:numFmt w:val="bullet"/>
+      <w:lvlText w:val=""/>
+      <w:lvlJc w:val="left"/>
+      <w:pPr>
+        <w:tabs>
+          <w:tab w:val="num" w:pos="2880"/>
+        </w:tabs>
+        <w:ind w:left="2880" w:hanging="360"/>
+      </w:pPr>
+      <w:rPr>
+        <w:rFonts w:ascii="Symbol" w:hAnsi="Symbol" w:hint="default"/>
+        <w:sz w:val="20"/>
+      </w:rPr>
+    </w:lvl>
+    <w:lvl w:ilvl="4" w:tentative="1">
+      <w:start w:val="1"/>
+      <w:numFmt w:val="bullet"/>
+      <w:lvlText w:val=""/>
+      <w:lvlJc w:val="left"/>
+      <w:pPr>
+        <w:tabs>
+          <w:tab w:val="num" w:pos="3600"/>
+        </w:tabs>
+        <w:ind w:left="3600" w:hanging="360"/>
+      </w:pPr>
+      <w:rPr>
+        <w:rFonts w:ascii="Symbol" w:hAnsi="Symbol" w:hint="default"/>
+        <w:sz w:val="20"/>
+      </w:rPr>
+    </w:lvl>
+    <w:lvl w:ilvl="5" w:tentative="1">
+      <w:start w:val="1"/>
+      <w:numFmt w:val="bullet"/>
+      <w:lvlText w:val=""/>
+      <w:lvlJc w:val="left"/>
+      <w:pPr>
+        <w:tabs>
+          <w:tab w:val="num" w:pos="4320"/>
+        </w:tabs>
+        <w:ind w:left="4320" w:hanging="360"/>
+      </w:pPr>
+      <w:rPr>
+        <w:rFonts w:ascii="Symbol" w:hAnsi="Symbol" w:hint="default"/>
+        <w:sz w:val="20"/>
+      </w:rPr>
+    </w:lvl>
+    <w:lvl w:ilvl="6" w:tentative="1">
+      <w:start w:val="1"/>
+      <w:numFmt w:val="bullet"/>
+      <w:lvlText w:val=""/>
+      <w:lvlJc w:val="left"/>
+      <w:pPr>
+        <w:tabs>
+          <w:tab w:val="num" w:pos="5040"/>
+        </w:tabs>
+        <w:ind w:left="5040" w:hanging="360"/>
+      </w:pPr>
+      <w:rPr>
+        <w:rFonts w:ascii="Symbol" w:hAnsi="Symbol" w:hint="default"/>
+        <w:sz w:val="20"/>
+      </w:rPr>
+    </w:lvl>
+    <w:lvl w:ilvl="7" w:tentative="1">
+      <w:start w:val="1"/>
+      <w:numFmt w:val="bullet"/>
+      <w:lvlText w:val=""/>
+      <w:lvlJc w:val="left"/>
+      <w:pPr>
+        <w:tabs>
+          <w:tab w:val="num" w:pos="5760"/>
+        </w:tabs>
+        <w:ind w:left="5760" w:hanging="360"/>
+      </w:pPr>
+      <w:rPr>
+        <w:rFonts w:ascii="Symbol" w:hAnsi="Symbol" w:hint="default"/>
+        <w:sz w:val="20"/>
+      </w:rPr>
+    </w:lvl>
+    <w:lvl w:ilvl="8" w:tentative="1">
+      <w:start w:val="1"/>
+      <w:numFmt w:val="bullet"/>
+      <w:lvlText w:val=""/>
+      <w:lvlJc w:val="left"/>
+      <w:pPr>
+        <w:tabs>
+          <w:tab w:val="num" w:pos="6480"/>
+        </w:tabs>
+        <w:ind w:left="6480" w:hanging="360"/>
+      </w:pPr>
+      <w:rPr>
+        <w:rFonts w:ascii="Symbol" w:hAnsi="Symbol" w:hint="default"/>
+        <w:sz w:val="20"/>
+      </w:rPr>
+    </w:lvl>
+  </w:abstractNum>
+  <w:abstractNum w:abstractNumId="1">
     <w:nsid w:val="60852993"/>
     <w:multiLevelType w:val="multilevel"/>
     <w:tmpl w:val="2DC096BE"/>
@@ -1130,6 +2877,9 @@
     </w:lvl>
   </w:abstractNum>
   <w:num w:numId="1">
+    <w:abstractNumId w:val="1"/>
+  </w:num>
+  <w:num w:numId="2">
     <w:abstractNumId w:val="0"/>
   </w:num>
 </w:numbering>
@@ -1529,6 +3279,26 @@
     <w:name w:val="Normal"/>
     <w:qFormat/>
   </w:style>
+  <w:style w:type="paragraph" w:styleId="3">
+    <w:name w:val="heading 3"/>
+    <w:basedOn w:val="a"/>
+    <w:link w:val="30"/>
+    <w:uiPriority w:val="9"/>
+    <w:qFormat/>
+    <w:rsid w:val="00F33111"/>
+    <w:pPr>
+      <w:spacing w:before="100" w:beforeAutospacing="1" w:after="100" w:afterAutospacing="1" w:line="240" w:lineRule="auto"/>
+      <w:outlineLvl w:val="2"/>
+    </w:pPr>
+    <w:rPr>
+      <w:rFonts w:ascii="Times New Roman" w:eastAsia="Times New Roman" w:hAnsi="Times New Roman" w:cs="Times New Roman"/>
+      <w:b/>
+      <w:bCs/>
+      <w:sz w:val="27"/>
+      <w:szCs w:val="27"/>
+      <w:lang w:eastAsia="ru-RU"/>
+    </w:rPr>
+  </w:style>
   <w:style w:type="character" w:default="1" w:styleId="a0">
     <w:name w:val="Default Paragraph Font"/>
     <w:uiPriority w:val="1"/>
@@ -1606,6 +3376,21 @@
     <w:name w:val="inline-flex"/>
     <w:basedOn w:val="a0"/>
     <w:rsid w:val="00E00BE3"/>
+  </w:style>
+  <w:style w:type="character" w:customStyle="1" w:styleId="30">
+    <w:name w:val="Заголовок 3 Знак"/>
+    <w:basedOn w:val="a0"/>
+    <w:link w:val="3"/>
+    <w:uiPriority w:val="9"/>
+    <w:rsid w:val="00F33111"/>
+    <w:rPr>
+      <w:rFonts w:ascii="Times New Roman" w:eastAsia="Times New Roman" w:hAnsi="Times New Roman" w:cs="Times New Roman"/>
+      <w:b/>
+      <w:bCs/>
+      <w:sz w:val="27"/>
+      <w:szCs w:val="27"/>
+      <w:lang w:eastAsia="ru-RU"/>
+    </w:rPr>
   </w:style>
 </w:styles>
 </file>

</xml_diff>